<commit_message>
fix: move cache ops outside transaction so chat 500s don't false-fail; increase api throttle to 200/min for auth users
</commit_message>
<xml_diff>
--- a/TADavinFix.docx
+++ b/TADavinFix.docx
@@ -14840,418 +14840,177 @@
     <w:p>
       <w:pPr>
         <w:pStyle w:val="ListParagraph"/>
-        <w:numPr>
-          <w:ilvl w:val="0"/>
-          <w:numId w:val="26"/>
-        </w:numPr>
-        <w:ind w:left="426"/>
-        <w:contextualSpacing w:val="0"/>
-        <w:rPr>
-          <w:szCs w:val="22"/>
-          <w:u w:val="single"/>
-          <w:lang w:val="id-ID"/>
-        </w:rPr>
-      </w:pPr>
-      <w:r>
-        <w:rPr>
-          <w:szCs w:val="22"/>
-          <w:u w:val="single"/>
-        </w:rPr>
-        <w:t>Jual Beli Rumah (Marketplace)</w:t>
+      </w:pPr>
+      <w:r>
+        <w:t>Jual Beli Rumah (Marketplace Properti)</w:t>
       </w:r>
     </w:p>
     <w:p>
       <w:pPr>
         <w:pStyle w:val="ListParagraph"/>
-        <w:numPr>
-          <w:ilvl w:val="1"/>
-          <w:numId w:val="25"/>
-        </w:numPr>
-        <w:ind w:left="851"/>
-        <w:contextualSpacing w:val="0"/>
-        <w:rPr>
-          <w:szCs w:val="22"/>
-          <w:lang w:val="id-ID"/>
-        </w:rPr>
-      </w:pPr>
-      <w:r>
-        <w:rPr>
-          <w:szCs w:val="22"/>
-          <w:lang w:val="id-ID"/>
-        </w:rPr>
-        <w:t>Menyediakan e</w:t>
-      </w:r>
-      <w:r>
-        <w:rPr>
-          <w:szCs w:val="22"/>
-          <w:lang w:val="id-ID"/>
-        </w:rPr>
-        <w:t>talase properti dinamis yang memungkinkan pengguna melakukan penelusuran unit rumah siap huni secara real-time.</w:t>
+      </w:pPr>
+      <w:r>
+        <w:t>Menyediakan etalase properti dinamis yang dapat dicari berdasarkan lokasi dan kata kunci, dilengkapi filter harga untuk mempersempit hasil pencarian secara real-time.</w:t>
       </w:r>
     </w:p>
     <w:p>
       <w:pPr>
         <w:pStyle w:val="ListParagraph"/>
-        <w:numPr>
-          <w:ilvl w:val="1"/>
-          <w:numId w:val="25"/>
-        </w:numPr>
-        <w:ind w:left="851"/>
-        <w:contextualSpacing w:val="0"/>
-        <w:rPr>
-          <w:szCs w:val="22"/>
-          <w:lang w:val="id-ID"/>
-        </w:rPr>
-      </w:pPr>
-      <w:r>
-        <w:rPr>
-          <w:szCs w:val="22"/>
-          <w:lang w:val="id-ID"/>
-        </w:rPr>
-        <w:lastRenderedPageBreak/>
-        <w:t>Mengimplementasikan matriks penapisan (filtering) berdasarkan kriteria lokasi, rentang harga, dan spesifikasi unit untuk mempercepat pencarian.</w:t>
-      </w:r>
-      <w:r>
-        <w:rPr>
-          <w:szCs w:val="22"/>
-          <w:lang w:val="id-ID"/>
-        </w:rPr>
-        <w:t>Spektrum toleransi anggaran harga, hingga atribut tipe kamar.</w:t>
+      </w:pPr>
+      <w:r>
+        <w:t>Menyediakan formulir penjualan properti bertahap yang mencakup unggah foto, input spesifikasi ruangan, denah kamar, serta penanda lokasi berbasis peta interaktif (OpenStreetMap).</w:t>
       </w:r>
     </w:p>
     <w:p>
       <w:pPr>
         <w:pStyle w:val="ListParagraph"/>
-        <w:numPr>
-          <w:ilvl w:val="1"/>
-          <w:numId w:val="25"/>
-        </w:numPr>
-        <w:ind w:left="851"/>
-        <w:contextualSpacing w:val="0"/>
-        <w:rPr>
-          <w:szCs w:val="22"/>
-          <w:lang w:val="id-ID"/>
-        </w:rPr>
-      </w:pPr>
-      <w:r>
-        <w:rPr>
-          <w:szCs w:val="22"/>
-          <w:lang w:val="id-ID"/>
-        </w:rPr>
-        <w:t>Menyajikan informasi detail properti yang komprehensif, mencakup deskripsi aset, galeri foto ruangan, data teknis bangunan, serta akses komunikasi langsung ke penjual melalui integrasi API WhatsApp.</w:t>
+      </w:pPr>
+      <w:r>
+        <w:t>Menyajikan halaman detail properti komprehensif yang memuat galeri foto, spesifikasi bangunan, denah ruangan, peta lokasi, serta akses langsung menghubungi penjual melalui API WhatsApp.</w:t>
       </w:r>
     </w:p>
     <w:p>
       <w:pPr>
         <w:pStyle w:val="ListParagraph"/>
-        <w:numPr>
-          <w:ilvl w:val="0"/>
-          <w:numId w:val="26"/>
-        </w:numPr>
-        <w:ind w:left="426"/>
-        <w:contextualSpacing w:val="0"/>
-        <w:rPr>
-          <w:szCs w:val="22"/>
-          <w:u w:val="single"/>
-          <w:lang w:val="id-ID"/>
-        </w:rPr>
-      </w:pPr>
-      <w:proofErr w:type="spellStart"/>
-      <w:r>
-        <w:rPr>
-          <w:szCs w:val="22"/>
-          <w:u w:val="single"/>
-        </w:rPr>
-        <w:t>Publikasi</w:t>
-      </w:r>
-      <w:proofErr w:type="spellEnd"/>
-      <w:r>
-        <w:rPr>
-          <w:szCs w:val="22"/>
-          <w:u w:val="single"/>
-        </w:rPr>
-        <w:t xml:space="preserve"> </w:t>
-      </w:r>
-      <w:proofErr w:type="spellStart"/>
-      <w:r>
-        <w:rPr>
-          <w:szCs w:val="22"/>
-          <w:u w:val="single"/>
-        </w:rPr>
-        <w:t>Proyek</w:t>
-      </w:r>
-      <w:proofErr w:type="spellEnd"/>
-      <w:r>
-        <w:rPr>
-          <w:szCs w:val="22"/>
-          <w:u w:val="single"/>
-        </w:rPr>
-        <w:t xml:space="preserve"> dan </w:t>
-      </w:r>
-      <w:proofErr w:type="spellStart"/>
-      <w:r>
-        <w:rPr>
-          <w:szCs w:val="22"/>
-          <w:u w:val="single"/>
-        </w:rPr>
-        <w:t>Sistem</w:t>
-      </w:r>
-      <w:proofErr w:type="spellEnd"/>
-      <w:r>
-        <w:rPr>
-          <w:szCs w:val="22"/>
-          <w:u w:val="single"/>
-        </w:rPr>
-        <w:t xml:space="preserve"> </w:t>
-      </w:r>
-      <w:proofErr w:type="spellStart"/>
-      <w:r>
-        <w:rPr>
-          <w:szCs w:val="22"/>
-          <w:u w:val="single"/>
-        </w:rPr>
-        <w:t>Penawaran</w:t>
-      </w:r>
-      <w:proofErr w:type="spellEnd"/>
-      <w:r>
-        <w:rPr>
-          <w:szCs w:val="22"/>
-          <w:u w:val="single"/>
-        </w:rPr>
-        <w:t xml:space="preserve"> (Bidding)</w:t>
+      </w:pPr>
+      <w:r>
+        <w:t>Publikasi Proyek dan Sistem Penawaran (Bidding)</w:t>
       </w:r>
     </w:p>
     <w:p>
       <w:pPr>
         <w:pStyle w:val="ListParagraph"/>
-        <w:numPr>
-          <w:ilvl w:val="1"/>
-          <w:numId w:val="28"/>
-        </w:numPr>
-        <w:ind w:left="851"/>
-        <w:contextualSpacing w:val="0"/>
-        <w:rPr>
-          <w:i/>
-          <w:iCs/>
-          <w:szCs w:val="22"/>
-          <w:lang w:val="id-ID"/>
-        </w:rPr>
-      </w:pPr>
-      <w:r>
-        <w:rPr>
-          <w:i/>
-          <w:iCs/>
-          <w:szCs w:val="22"/>
-          <w:lang w:val="id-ID"/>
-        </w:rPr>
-        <w:t>Memfasilitasi pengguna untuk mempublikasikan tender proyek konstruksi (bangun baru atau renovasi) dengan detail spesifikasi seperti luas lantai, ekspektasi material, dan lampiran foto kondisi lahan.</w:t>
+      </w:pPr>
+      <w:r>
+        <w:t>Memfasilitasi publikasi tender proyek konstruksi oleh Klien dengan detail spesifikasi, foto lokasi, estimasi anggaran, tenggat waktu, dan penanda lokasi berbasis peta.</w:t>
       </w:r>
     </w:p>
     <w:p>
       <w:pPr>
         <w:pStyle w:val="ListParagraph"/>
-        <w:numPr>
-          <w:ilvl w:val="1"/>
-          <w:numId w:val="28"/>
-        </w:numPr>
-        <w:ind w:left="851"/>
-        <w:contextualSpacing w:val="0"/>
-        <w:rPr>
-          <w:i/>
-          <w:iCs/>
-          <w:szCs w:val="22"/>
-          <w:lang w:val="id-ID"/>
-        </w:rPr>
-      </w:pPr>
-      <w:r>
-        <w:rPr>
-          <w:i/>
-          <w:iCs/>
-          <w:szCs w:val="22"/>
-          <w:lang w:val="id-ID"/>
-        </w:rPr>
-        <w:t>Menyediakan mekanisme bagi Arsitek dan Kontraktor untuk mengirimkan dokumen penawaran harga (bid) secara terpusat pada setiap proyek yang dipublikasikan.</w:t>
+      </w:pPr>
+      <w:r>
+        <w:t>Menyediakan mekanisme bagi Arsitek dan Kontraktor untuk mengajukan penawaran harga (bid) yang mencakup nominal, durasi pengerjaan, dan dokumen proposal teknis pada setiap proyek yang masih berstatus lelang terbuka.</w:t>
       </w:r>
     </w:p>
     <w:p>
       <w:pPr>
         <w:pStyle w:val="ListParagraph"/>
-        <w:numPr>
-          <w:ilvl w:val="1"/>
-          <w:numId w:val="28"/>
-        </w:numPr>
-        <w:ind w:left="851"/>
-        <w:contextualSpacing w:val="0"/>
-        <w:rPr>
-          <w:i/>
-          <w:iCs/>
-          <w:szCs w:val="22"/>
-          <w:lang w:val="id-ID"/>
-        </w:rPr>
-      </w:pPr>
-      <w:r>
-        <w:rPr>
-          <w:i/>
-          <w:iCs/>
-          <w:szCs w:val="22"/>
-          <w:lang w:val="id-ID"/>
-        </w:rPr>
-        <w:t>Mengimplementasikan dasbor manajemen penawaran yang memungkinkan pemilik proyek untuk memantau, membandingkan, dan memilih pemenang lelang secara manual berdasarkan kecocokan proposal.</w:t>
+      </w:pPr>
+      <w:r>
+        <w:t>Mengimplementasikan dasbor perbandingan penawaran bagi Klien yang menampilkan seluruh bid yang diurutkan berdasarkan skor rekomendasi algoritma Weighted Scoring (kombinasi bobot harga dan reputasi penyedia jasa).</w:t>
       </w:r>
     </w:p>
     <w:p>
       <w:pPr>
         <w:pStyle w:val="ListParagraph"/>
-        <w:numPr>
-          <w:ilvl w:val="0"/>
-          <w:numId w:val="26"/>
-        </w:numPr>
-        <w:ind w:left="426"/>
-        <w:contextualSpacing w:val="0"/>
-        <w:rPr>
-          <w:szCs w:val="22"/>
-          <w:u w:val="single"/>
-          <w:lang w:val="id-ID"/>
-        </w:rPr>
-      </w:pPr>
-      <w:proofErr w:type="spellStart"/>
-      <w:r>
-        <w:rPr>
-          <w:szCs w:val="22"/>
-          <w:u w:val="single"/>
-        </w:rPr>
-        <w:t>Perekrutan</w:t>
-      </w:r>
-      <w:proofErr w:type="spellEnd"/>
-      <w:r>
-        <w:rPr>
-          <w:szCs w:val="22"/>
-          <w:u w:val="single"/>
-        </w:rPr>
-        <w:t xml:space="preserve"> </w:t>
-      </w:r>
-      <w:proofErr w:type="spellStart"/>
-      <w:r>
-        <w:rPr>
-          <w:szCs w:val="22"/>
-          <w:u w:val="single"/>
-        </w:rPr>
-        <w:t>Profesional</w:t>
-      </w:r>
-      <w:proofErr w:type="spellEnd"/>
-      <w:r>
-        <w:rPr>
-          <w:szCs w:val="22"/>
-          <w:u w:val="single"/>
-        </w:rPr>
-        <w:t xml:space="preserve"> (</w:t>
-      </w:r>
-      <w:proofErr w:type="spellStart"/>
-      <w:r>
-        <w:rPr>
-          <w:szCs w:val="22"/>
-          <w:u w:val="single"/>
-        </w:rPr>
-        <w:t>Arsitek</w:t>
-      </w:r>
-      <w:proofErr w:type="spellEnd"/>
-      <w:r>
-        <w:rPr>
-          <w:szCs w:val="22"/>
-          <w:u w:val="single"/>
-        </w:rPr>
-        <w:t xml:space="preserve"> dan </w:t>
-      </w:r>
-      <w:proofErr w:type="spellStart"/>
-      <w:r>
-        <w:rPr>
-          <w:szCs w:val="22"/>
-          <w:u w:val="single"/>
-        </w:rPr>
-        <w:t>Kontraktor</w:t>
-      </w:r>
-      <w:proofErr w:type="spellEnd"/>
-      <w:r>
-        <w:rPr>
-          <w:szCs w:val="22"/>
-          <w:u w:val="single"/>
-        </w:rPr>
-        <w:t>)</w:t>
+      </w:pPr>
+      <w:r>
+        <w:t>Perekrutan Profesional (Arsitek dan Kontraktor)</w:t>
       </w:r>
     </w:p>
     <w:p>
       <w:pPr>
         <w:pStyle w:val="ListParagraph"/>
-        <w:numPr>
-          <w:ilvl w:val="0"/>
-          <w:numId w:val="31"/>
-        </w:numPr>
-        <w:contextualSpacing w:val="0"/>
-        <w:rPr>
-          <w:i/>
-          <w:iCs/>
-          <w:szCs w:val="22"/>
-          <w:lang w:val="id-ID"/>
-        </w:rPr>
-      </w:pPr>
-      <w:r>
-        <w:rPr>
-          <w:i/>
-          <w:iCs/>
-          <w:szCs w:val="22"/>
-          <w:lang w:val="id-ID"/>
-        </w:rPr>
-        <w:t>Menyediakan direktori profil tenaga ahli konstruksi yang dapat dijelajahi oleh pengguna berdasarkan kategori keahlian profesional.</w:t>
+      </w:pPr>
+      <w:r>
+        <w:t>Menyediakan direktori tenaga ahli konstruksi yang dapat dijelajahi berdasarkan kategori profesi (Arsitek/Kontraktor) dan dilengkapi filter pencarian.</w:t>
       </w:r>
     </w:p>
     <w:p>
       <w:pPr>
         <w:pStyle w:val="ListParagraph"/>
-        <w:numPr>
-          <w:ilvl w:val="0"/>
-          <w:numId w:val="31"/>
-        </w:numPr>
-        <w:contextualSpacing w:val="0"/>
-        <w:rPr>
-          <w:i/>
-          <w:iCs/>
-          <w:szCs w:val="22"/>
-          <w:lang w:val="id-ID"/>
-        </w:rPr>
-      </w:pPr>
-      <w:r>
-        <w:rPr>
-          <w:i/>
-          <w:iCs/>
-          <w:szCs w:val="22"/>
-          <w:lang w:val="id-ID"/>
-        </w:rPr>
-        <w:t>Menampilkan halaman portofolio digital yang berisi riwayat pekerjaan terdahulu dan akumulasi rating dari pengguna lain sebagai parameter kredibilitas.</w:t>
+      </w:pPr>
+      <w:r>
+        <w:t>Menampilkan halaman profil profesional yang memuat portofolio proyek, rating dan ulasan dari klien sebelumnya, anggota tim, serta statistik proyek yang telah diselesaikan.</w:t>
       </w:r>
     </w:p>
     <w:p>
       <w:pPr>
         <w:pStyle w:val="ListParagraph"/>
-        <w:numPr>
-          <w:ilvl w:val="0"/>
-          <w:numId w:val="31"/>
-        </w:numPr>
-        <w:contextualSpacing w:val="0"/>
-        <w:rPr>
-          <w:i/>
-          <w:iCs/>
-          <w:szCs w:val="22"/>
-          <w:lang w:val="id-ID"/>
-        </w:rPr>
-      </w:pPr>
-      <w:r>
-        <w:rPr>
-          <w:i/>
-          <w:iCs/>
-          <w:szCs w:val="22"/>
-          <w:lang w:val="id-ID"/>
-        </w:rPr>
-        <w:t>Menyediakan fitur kontak instan yang memungkinkan pengguna untuk melakukan konsultasi awal atau negosiasi langsung dengan penyedia jasa melalui platform WhatsApp.</w:t>
+      </w:pPr>
+      <w:r>
+        <w:t>Menyediakan fitur kontak instan dan pemesanan jasa (hire) yang memungkinkan Klien menghubungi atau mempekerjakan profesional secara langsung melalui platform.</w:t>
+      </w:r>
+    </w:p>
+    <w:p>
+      <w:pPr>
+        <w:pStyle w:val="ListParagraph"/>
+      </w:pPr>
+      <w:r>
+        <w:t>Manajemen Proyek Pasca-Lelang</w:t>
+      </w:r>
+    </w:p>
+    <w:p>
+      <w:pPr>
+        <w:pStyle w:val="ListParagraph"/>
+      </w:pPr>
+      <w:r>
+        <w:t>Pelacakan milestone proyek dengan status penyelesaian, bukti foto, dan konfirmasi dari kedua belah pihak (Klien dan penyedia jasa).</w:t>
+      </w:r>
+    </w:p>
+    <w:p>
+      <w:pPr>
+        <w:pStyle w:val="ListParagraph"/>
+      </w:pPr>
+      <w:r>
+        <w:t>Pencatatan log harian (daily log) progres pengerjaan proyek oleh penyedia jasa yang dapat dimonitor oleh Klien secara real-time.</w:t>
+      </w:r>
+    </w:p>
+    <w:p>
+      <w:pPr>
+        <w:pStyle w:val="ListParagraph"/>
+      </w:pPr>
+      <w:r>
+        <w:t>Brankas dokumen digital (document vault) untuk menyimpan dan mengelola dokumen kontrak, proposal, dan gambar teknis proyek.</w:t>
+      </w:r>
+    </w:p>
+    <w:p>
+      <w:pPr>
+        <w:pStyle w:val="ListParagraph"/>
+      </w:pPr>
+      <w:r>
+        <w:t>Obrolan dan Notifikasi Real-time</w:t>
+      </w:r>
+    </w:p>
+    <w:p>
+      <w:pPr>
+        <w:pStyle w:val="ListParagraph"/>
+      </w:pPr>
+      <w:r>
+        <w:t>Fitur obrolan langsung (chat) antar pengguna untuk negosiasi kontrak, konsultasi, dan diskusi proyek secara real-time.</w:t>
+      </w:r>
+    </w:p>
+    <w:p>
+      <w:pPr>
+        <w:pStyle w:val="ListParagraph"/>
+      </w:pPr>
+      <w:r>
+        <w:t>Sistem notifikasi yang menampilkan informasi status penawaran, proyek baru yang relevan, dan pesan masuk secara real-time.</w:t>
+      </w:r>
+    </w:p>
+    <w:p>
+      <w:pPr>
+        <w:pStyle w:val="ListParagraph"/>
+      </w:pPr>
+      <w:r>
+        <w:t>Manajemen Profil dan Portofolio Digital</w:t>
+      </w:r>
+    </w:p>
+    <w:p>
+      <w:pPr>
+        <w:pStyle w:val="ListParagraph"/>
+      </w:pPr>
+      <w:r>
+        <w:t>Halaman profil pengguna yang menampilkan informasi personal, riwayat properti, dan daftar proyek yang sedang berjalan.</w:t>
+      </w:r>
+    </w:p>
+    <w:p>
+      <w:pPr>
+        <w:pStyle w:val="ListParagraph"/>
+      </w:pPr>
+      <w:r>
+        <w:t>Profil profesional (Arsitek/Kontraktor) yang dilengkapi unggahan portofolio visual, data perusahaan, metadata keahlian, dan dokumen pendukung.</w:t>
       </w:r>
     </w:p>
     <w:p>
@@ -27073,7 +26832,7 @@
         </w:rPr>
       </w:pPr>
       <w:r>
-        <w:t>Pengujian dilakukan dengan responden sebanyak 15 orang yang terdiri dari 5 orang Klien (pencari properti), 5 orang Arsitek profesional, dan 5 orang Kontraktor sipil. Setiap responden dipastikan telah mencoba aplikasi sebelum mengisi kuesioner. Uji coba dilakukan secara sinkron melalui demonstrasi langsung dan Zoom. Dokumentasi kegiatan dapat dilihat di Lampiran 1, dan daftar pertanyaan serta perhitungan hasil kuesioner dapat dilihat di Lampiran 2.</w:t>
+        <w:t>Pengujian dilakukan dengan responden sebanyak 9 orang yang terdiri dari 3 orang Klien (pencari properti), 3 orang Arsitek profesional, dan 3 orang Kontraktor sipil. Setiap responden dipastikan telah mencoba aplikasi sebelum mengisi kuesioner. Uji coba dilakukan secara sinkron melalui demonstrasi langsung dan Zoom. Dokumentasi kegiatan dapat dilihat di Lampiran 1, dan daftar pertanyaan serta perhitungan hasil kuesioner dapat dilihat di Lampiran 2.</w:t>
       </w:r>
     </w:p>
     <w:p>

</xml_diff>